<commit_message>
test: the Word-saved fixtures carry no initials of whoever saved them, and the open copy's edits read as accepted
The review of 2a92d4cb found Word's initials of the person who saved the fixtures still on the
replies; they are AA now, from Word's own files again. The test's docstring says the account
record was removed too, and the copy with changes left open is read: its recorded suggestions
are the decided copy's, and with every change accepted each reads as its new words.

Co-Authored-By: Claude Opus 5.5 <noreply@anthropic.com>
</commit_message>
<xml_diff>
--- a/tests/data/word/suggestions-decided.docx
+++ b/tests/data/word/suggestions-decided.docx
@@ -1170,7 +1170,7 @@
       </w:r>
     </w:p>
   </w:comment>
-  <w:comment w:id="11" w:author="Ana Author" w:date="2026-10-20T17:19:00Z" w:initials="BC">
+  <w:comment w:id="11" w:author="Ana Author" w:date="2026-10-20T17:19:00Z" w:initials="AA">
     <w:p>
       <w:pPr>
         <w:pStyle w:val="af1"/>
@@ -1206,7 +1206,7 @@
       </w:r>
     </w:p>
   </w:comment>
-  <w:comment w:id="18" w:author="Ana Author" w:date="2026-10-20T17:19:00Z" w:initials="BC">
+  <w:comment w:id="18" w:author="Ana Author" w:date="2026-10-20T17:19:00Z" w:initials="AA">
     <w:p>
       <w:pPr>
         <w:pStyle w:val="af1"/>

</xml_diff>